<commit_message>
Zakres koła: pełny stos budowy humanoidów i czworonogów
- statut.md § 2: rozwój zdolności obejmuje wszystko, co potrzebne do
  budowy robotów humanoidalnych i czworonożnych: AI, automatykę
  i sterowanie, robotykę, mechanikę i konstrukcję, napędy, elektronikę
  i systemy wbudowane, oprogramowanie robotów, wytwarzanie i integrację,
  design i prowadzenie projektów.
- § 11: piąta sekcja Control & Embedded Systems, zakres każdej sekcji,
  zespoły projektowe dla konkretnych maszyn.
- program.md, szablony issue, deklaracja, README koła, review: zgodne
  z pięcioma sekcjami; DOCX wygenerowane ponownie.

Co-Authored-By: Claude Opus 5.5 <noreply@anthropic.com>
</commit_message>
<xml_diff>
--- a/kolo-naukowe/dokumenty/do-druku/regulamin.docx
+++ b/kolo-naukowe/dokumenty/do-druku/regulamin.docx
@@ -231,7 +231,79 @@
         <w:t>rozwój zdolności członków w kierunku physical AI</w:t>
       </w:r>
       <w:r>
-        <w:t>: nauka i praktyka w zakresie lokomocji uczonej w symulacji i przenoszonej na maszynę (sim-to-real), modeli świata i modeli wizyjno-językowych, robotów kroczących, w tym czworonożnych i humanoidalnych, manipulacji oraz konstrukcji i napędów maszyn, przez pracę na działającym sprzęcie i z realnymi danymi;</w:t>
+        <w:t xml:space="preserve"> w pełnym zakresie potrzebnym do zaprojektowania, zbudowania i uruchomienia robotów kroczących, w szczególności humanoidalnych i czworonożnych, przez pracę na działającym sprzęcie i z realnymi danymi; zakres ten obejmuje:</w:t>
+      </w:r>
+    </w:p>
+    <w:p>
+      <w:pPr>
+        <w:spacing w:after="80"/>
+        <w:ind w:left="540"/>
+      </w:pPr>
+      <w:r>
+        <w:t>1. sztuczną inteligencję robotów: uczenie lokomocji w symulacji i przenoszenie na maszynę (sim-to-real), uczenie ze wzmocnieniem, modele świata, modele wizyjno-językowe, percepcję i planowanie;</w:t>
+      </w:r>
+    </w:p>
+    <w:p>
+      <w:pPr>
+        <w:spacing w:after="80"/>
+        <w:ind w:left="540"/>
+      </w:pPr>
+      <w:r>
+        <w:t>2. automatykę i sterowanie: sterowanie ruchem, siłą i momentem, estymację stanu, fuzję danych z czujników, sterowanie w czasie rzeczywistym;</w:t>
+      </w:r>
+    </w:p>
+    <w:p>
+      <w:pPr>
+        <w:spacing w:after="80"/>
+        <w:ind w:left="540"/>
+      </w:pPr>
+      <w:r>
+        <w:t>3. robotykę: kinematykę i dynamikę robotów kroczących, równowagę i chód, manipulację i chwytanie, interakcję człowiek–robot;</w:t>
+      </w:r>
+    </w:p>
+    <w:p>
+      <w:pPr>
+        <w:spacing w:after="80"/>
+        <w:ind w:left="540"/>
+      </w:pPr>
+      <w:r>
+        <w:t>4. mechanikę i konstrukcję maszyn: projektowanie CAD, obliczenia wytrzymałościowe, mechanizmy i przekładnie, układy nóg i rąk, dobór materiałów;</w:t>
+      </w:r>
+    </w:p>
+    <w:p>
+      <w:pPr>
+        <w:spacing w:after="80"/>
+        <w:ind w:left="540"/>
+      </w:pPr>
+      <w:r>
+        <w:t>5. napędy, elektronikę i systemy wbudowane: silniki i ich sterowniki, elektronikę mocy, zasilanie i akumulatory, czujniki, mikrokontrolery, magistrale komunikacyjne;</w:t>
+      </w:r>
+    </w:p>
+    <w:p>
+      <w:pPr>
+        <w:spacing w:after="80"/>
+        <w:ind w:left="540"/>
+      </w:pPr>
+      <w:r>
+        <w:t>6. oprogramowanie robotów: systemy czasu rzeczywistego, middleware robotyczny, symulację i cyfrowe bliźniaki, narzędzia do zbierania danych;</w:t>
+      </w:r>
+    </w:p>
+    <w:p>
+      <w:pPr>
+        <w:spacing w:after="80"/>
+        <w:ind w:left="540"/>
+      </w:pPr>
+      <w:r>
+        <w:t>7. wytwarzanie i integrację: druk 3D, obróbkę skrawaniem, cięcie laserowe, montaż, testy, bezpieczeństwo maszyn;</w:t>
+      </w:r>
+    </w:p>
+    <w:p>
+      <w:pPr>
+        <w:spacing w:after="80"/>
+        <w:ind w:left="540"/>
+      </w:pPr>
+      <w:r>
+        <w:t>8. design przemysłowy i prowadzenie projektów inżynierskich;</w:t>
       </w:r>
     </w:p>
     <w:p>
@@ -1689,7 +1761,7 @@
         <w:ind w:left="180"/>
       </w:pPr>
       <w:r>
-        <w:t>1. Prace Koła prowadzą sekcje odpowiadające domenom Machinekind:</w:t>
+        <w:t>1. Prace Koła prowadzą sekcje. Pierwsze cztery odpowiadają domenom Machinekind, piąta obejmuje automatykę i elektronikę:</w:t>
       </w:r>
     </w:p>
     <w:p>
@@ -1698,7 +1770,16 @@
         <w:ind w:left="360"/>
       </w:pPr>
       <w:r>
-        <w:t>1. Locomotion AI;</w:t>
+        <w:t xml:space="preserve">1. </w:t>
+      </w:r>
+      <w:r>
+        <w:rPr>
+          <w:b/>
+        </w:rPr>
+        <w:t>Locomotion AI</w:t>
+      </w:r>
+      <w:r>
+        <w:t>: uczenie lokomocji, uczenie ze wzmocnieniem, symulacja, sim-to-real;</w:t>
       </w:r>
     </w:p>
     <w:p>
@@ -1707,7 +1788,16 @@
         <w:ind w:left="360"/>
       </w:pPr>
       <w:r>
-        <w:t>2. World Models &amp; VLM;</w:t>
+        <w:t xml:space="preserve">2. </w:t>
+      </w:r>
+      <w:r>
+        <w:rPr>
+          <w:b/>
+        </w:rPr>
+        <w:t>World Models &amp; VLM</w:t>
+      </w:r>
+      <w:r>
+        <w:t>: percepcja, modele świata, modele wizyjno-językowe, planowanie;</w:t>
       </w:r>
     </w:p>
     <w:p>
@@ -1716,7 +1806,16 @@
         <w:ind w:left="360"/>
       </w:pPr>
       <w:r>
-        <w:t>3. Robotics Engineering &amp; Manufacturing;</w:t>
+        <w:t xml:space="preserve">3. </w:t>
+      </w:r>
+      <w:r>
+        <w:rPr>
+          <w:b/>
+        </w:rPr>
+        <w:t>Robotics Engineering &amp; Manufacturing</w:t>
+      </w:r>
+      <w:r>
+        <w:t>: mechanika, konstrukcja, napędy, kinematyka i dynamika, wytwarzanie i montaż;</w:t>
       </w:r>
     </w:p>
     <w:p>
@@ -1725,16 +1824,34 @@
         <w:ind w:left="360"/>
       </w:pPr>
       <w:r>
-        <w:t>4. Design &amp; Program.</w:t>
+        <w:t xml:space="preserve">4. </w:t>
+      </w:r>
+      <w:r>
+        <w:rPr>
+          <w:b/>
+        </w:rPr>
+        <w:t>Control &amp; Embedded Systems</w:t>
+      </w:r>
+      <w:r>
+        <w:t>: automatyka i sterowanie, elektronika, zasilanie, czujniki, systemy wbudowane, oprogramowanie czasu rzeczywistego;</w:t>
       </w:r>
     </w:p>
     <w:p>
       <w:pPr>
         <w:spacing w:after="80"/>
-        <w:ind w:left="180"/>
-      </w:pPr>
-      <w:r>
-        <w:t>2. Pracą sekcji kieruje prowadzący sekcję, wybierany przez członków sekcji na semestr i zatwierdzany przez Zarząd. Prowadzący sekcję odpowiada za cele semestru sekcji, potwierdza spełnienie kryteriów odbioru zadań i uczestniczy w przeglądzie aktywności (§ 6 ust. 2).</w:t>
+        <w:ind w:left="360"/>
+      </w:pPr>
+      <w:r>
+        <w:t xml:space="preserve">5. </w:t>
+      </w:r>
+      <w:r>
+        <w:rPr>
+          <w:b/>
+        </w:rPr>
+        <w:t>Design &amp; Program</w:t>
+      </w:r>
+      <w:r>
+        <w:t>: forma i design przemysłowy, prowadzenie projektów, przygotowanie zespołów startupowych.</w:t>
       </w:r>
     </w:p>
     <w:p>
@@ -1743,7 +1860,7 @@
         <w:ind w:left="180"/>
       </w:pPr>
       <w:r>
-        <w:t>3. Mentora merytorycznego sekcji może wskazać Machinekind; mentor nie jest członkiem władz Koła.</w:t>
+        <w:t>2. Pracą sekcji kieruje prowadzący sekcję, wybierany przez członków sekcji na semestr i zatwierdzany przez Zarząd. Prowadzący sekcję odpowiada za cele semestru sekcji, potwierdza spełnienie kryteriów odbioru zadań i uczestniczy w przeglądzie aktywności (§ 6 ust. 2).</w:t>
       </w:r>
     </w:p>
     <w:p>
@@ -1752,7 +1869,25 @@
         <w:ind w:left="180"/>
       </w:pPr>
       <w:r>
-        <w:t>4. Walne Zgromadzenie może utworzyć nową sekcję albo zlikwidować sekcję, która przez semestr nie prowadzi prac.</w:t>
+        <w:t>3. Mentora merytorycznego sekcji może wskazać Machinekind; mentor nie jest członkiem władz Koła.</w:t>
+      </w:r>
+    </w:p>
+    <w:p>
+      <w:pPr>
+        <w:spacing w:after="80"/>
+        <w:ind w:left="180"/>
+      </w:pPr>
+      <w:r>
+        <w:t>4. Do budowy konkretnej maszyny, w szczególności robota humanoidalnego lub czworonożnego, Zarząd powołuje zespół projektowy złożony z członków różnych sekcji, z kierownikiem projektu. Zespół projektowy ma cel, harmonogram i kryterium odbioru zgodne z § 2 ust. 2 pkt 1.</w:t>
+      </w:r>
+    </w:p>
+    <w:p>
+      <w:pPr>
+        <w:spacing w:after="80"/>
+        <w:ind w:left="180"/>
+      </w:pPr>
+      <w:r>
+        <w:t>5. Walne Zgromadzenie może utworzyć nową sekcję albo zlikwidować sekcję, która przez semestr nie prowadzi prac.</w:t>
       </w:r>
     </w:p>
     <w:p>

</xml_diff>

<commit_message>
Regulamin: co najmniej jeden opiekun, bez listy sekcji
Liczba opiekunów elastyczna (zgodę wyraża którykolwiek), sekcje usunięte z regulaminu; wpis w decyzje.md, DOCX wygenerowany ponownie.

Co-Authored-By: Claude Opus 5.5 <noreply@anthropic.com>
</commit_message>
<xml_diff>
--- a/kolo-naukowe/dokumenty/do-druku/regulamin.docx
+++ b/kolo-naukowe/dokumenty/do-druku/regulamin.docx
@@ -414,7 +414,7 @@
         <w:rPr>
           <w:rFonts w:cstheme="minorHAnsi"/>
         </w:rPr>
-        <w:t xml:space="preserve">projekty prowadzone w sekcjach i zespołach projektowych, z których każdy kończy się działającym wynikiem,</w:t>
+        <w:t xml:space="preserve">projekty prowadzone w zespołach projektowych, z których każdy kończy się działającym wynikiem,</w:t>
       </w:r>
     </w:p>
     <w:p>
@@ -816,7 +816,7 @@
         <w:rPr>
           <w:rFonts w:cstheme="minorHAnsi"/>
         </w:rPr>
-        <w:t xml:space="preserve">O przyjęciu w poczet członka Koła decyduje Zarząd w drodze uchwały podjętej zwykłą większością głosów, po złożeniu deklaracji członkowskiej i wykonaniu zadania wstępnego w wybranej sekcji. Członków honorowych powołuje Zarząd.</w:t>
+        <w:t xml:space="preserve">O przyjęciu w poczet członka Koła decyduje Zarząd w drodze uchwały podjętej zwykłą większością głosów, po złożeniu deklaracji członkowskiej i wykonaniu zadania wstępnego. Członków honorowych powołuje Zarząd.</w:t>
       </w:r>
     </w:p>
     <w:p>
@@ -1114,7 +1114,7 @@
         <w:rPr>
           <w:rFonts w:cstheme="minorHAnsi"/>
         </w:rPr>
-        <w:t xml:space="preserve">Przed podjęciem decyzji na podstawie ust. 6 pkt 6.1 i 6.3 członek może złożyć wyjaśnienia. Od decyzji podjętej przez Zarząd na tej podstawie przysługuje odwołanie do opiekunów naukowych w terminie 14 dni od daty jej otrzymania; opiekunowie rozstrzygają je ostatecznie.</w:t>
+        <w:t xml:space="preserve">Przed podjęciem decyzji na podstawie ust. 6 pkt 6.1 i 6.3 członek może złożyć wyjaśnienia. Od decyzji podjętej przez Zarząd na tej podstawie przysługuje odwołanie do opiekuna naukowego w terminie 14 dni od daty jej otrzymania; opiekun rozstrzyga je ostatecznie.</w:t>
       </w:r>
     </w:p>
     <w:p>
@@ -1228,23 +1228,7 @@
         <w:rPr>
           <w:rFonts w:cstheme="minorHAnsi"/>
         </w:rPr>
-        <w:t xml:space="preserve">Koło posiada dwóch opiekunów naukowych, nauczycieli akademickich Politechniki Wrocławskiej: z Wydziału Informatyki i Telekomunikacji oraz z Wydziału Mechanicznego, powołanych za ich pisemną zgodą. Opiekun nadzoruje zgodność działań Koła z Regulaminem, podpisuje plany pracy, wnioski o dofinansowanie i sprawozdania oraz wyraża zgodę na sprawy wskazane w Regulaminie.</w:t>
-      </w:r>
-    </w:p>
-    <w:p>
-      <w:pPr>
-        <w:numPr>
-          <w:ilvl w:val="0"/>
-          <w:numId w:val="43"/>
-        </w:numPr>
-        <w:spacing w:before="24" w:after="0" w:line="240" w:lineRule="auto"/>
-        <w:jc w:val="both"/>
-      </w:pPr>
-      <w:r>
-        <w:rPr>
-          <w:rFonts w:cstheme="minorHAnsi"/>
-        </w:rPr>
-        <w:t xml:space="preserve">Prace Koła prowadzą sekcje: Lokomocji (Locomotion AI), Modeli Świata (World Models &amp; VLM), Konstrukcji i Wytwarzania (Robotics Engineering &amp; Manufacturing), Automatyki i Systemów Wbudowanych (Control &amp; Embedded Systems) oraz Wzornictwa i Prowadzenia Projektów (Design &amp; Program). Sekcje tworzy i likwiduje Zarząd.</w:t>
+        <w:t xml:space="preserve">Koło posiada opiekuna naukowego, nauczyciela akademickiego Politechniki Wrocławskiej, powołanego za jego pisemną zgodą. Koło może mieć więcej niż jednego opiekuna; zgodę wymaganą w Regulaminie wyraża wtedy którykolwiek z nich. Opiekun nadzoruje zgodność działań Koła z Regulaminem i podpisuje plany pracy, wnioski o dofinansowanie i sprawozdania.</w:t>
       </w:r>
     </w:p>
     <w:p>
@@ -1436,7 +1420,7 @@
         <w:rPr>
           <w:rFonts w:cstheme="minorHAnsi"/>
         </w:rPr>
-        <w:t xml:space="preserve">tworzy sekcje i powołuje zespoły projektowe do budowy konkretnych maszyn.</w:t>
+        <w:t xml:space="preserve">powołuje zespoły projektowe do budowy konkretnych maszyn.</w:t>
       </w:r>
     </w:p>
     <w:p>
@@ -1506,7 +1490,7 @@
         <w:rPr>
           <w:rFonts w:cstheme="minorHAnsi"/>
         </w:rPr>
-        <w:t xml:space="preserve">Zarząd na kolejną kadencję powołuje ustępujący Zarząd, za zgodą opiekunów naukowych; ta sama osoba może pełnić funkcję ponownie,</w:t>
+        <w:t xml:space="preserve">Zarząd na kolejną kadencję powołuje ustępujący Zarząd, za zgodą opiekuna naukowego; ta sama osoba może pełnić funkcję ponownie,</w:t>
       </w:r>
     </w:p>
     <w:p>
@@ -1524,7 +1508,7 @@
         <w:rPr>
           <w:rFonts w:cstheme="minorHAnsi"/>
         </w:rPr>
-        <w:t xml:space="preserve">w przypadku rezygnacji lub odwołania członka Zarządu pozostali członkowie Zarządu, za zgodą opiekunów naukowych, powołują następcę w ciągu 30 dni,</w:t>
+        <w:t xml:space="preserve">w przypadku rezygnacji lub odwołania członka Zarządu pozostali członkowie Zarządu, za zgodą opiekuna naukowego, powołują następcę w ciągu 30 dni,</w:t>
       </w:r>
     </w:p>
     <w:p>
@@ -1560,7 +1544,7 @@
         <w:rPr>
           <w:rFonts w:cstheme="minorHAnsi"/>
         </w:rPr>
-        <w:t xml:space="preserve">członka Zarządu odwołują opiekunowie naukowi z własnej inicjatywy albo na wniosek pozostałych członków Zarządu.</w:t>
+        <w:t xml:space="preserve">członka Zarządu odwołuje opiekun naukowy z własnej inicjatywy albo na wniosek pozostałych członków Zarządu.</w:t>
       </w:r>
     </w:p>
     <w:p>
@@ -1608,7 +1592,7 @@
         <w:rPr>
           <w:rFonts w:cstheme="minorHAnsi"/>
         </w:rPr>
-        <w:t xml:space="preserve">Członkowie Zarządu zobowiązani są do złożenia pod koniec kadencji sprawozdania ze swojej działalności opiekunom naukowym.</w:t>
+        <w:t xml:space="preserve">Członkowie Zarządu zobowiązani są do złożenia pod koniec kadencji sprawozdania ze swojej działalności opiekunowi naukowemu.</w:t>
       </w:r>
     </w:p>
     <w:p>
@@ -1652,7 +1636,7 @@
         <w:rPr>
           <w:rFonts w:cstheme="minorHAnsi"/>
         </w:rPr>
-        <w:t xml:space="preserve">Zmiana Regulaminu wymaga uchwały Zarządu podjętej jednomyślnie, za zgodą opiekunów naukowych.</w:t>
+        <w:t xml:space="preserve">Zmiana Regulaminu wymaga uchwały Zarządu podjętej jednomyślnie, za zgodą opiekuna naukowego.</w:t>
       </w:r>
     </w:p>
     <w:p>
@@ -1684,7 +1668,7 @@
         <w:rPr>
           <w:rFonts w:cstheme="minorHAnsi"/>
         </w:rPr>
-        <w:t xml:space="preserve">Zarząd jednomyślną uchwałą, za zgodą opiekunów naukowych, może zawiesić działalność Koła lub je rozwiązać.</w:t>
+        <w:t xml:space="preserve">Zarząd jednomyślną uchwałą, za zgodą opiekuna naukowego, może zawiesić działalność Koła lub je rozwiązać.</w:t>
       </w:r>
     </w:p>
     <w:p>

</xml_diff>